<commit_message>
Epic 1 - new report
</commit_message>
<xml_diff>
--- a/ai_13/kyrylo_hrabovenskyi/epic_1/epic_1_report_kyrylo_hrabovenskyi.docx
+++ b/ai_13/kyrylo_hrabovenskyi/epic_1/epic_1_report_kyrylo_hrabovenskyi.docx
@@ -104,12 +104,12 @@
             <wp:extent cx="2727722" cy="2571750"/>
             <wp:effectExtent b="0" l="0" r="0" t="0"/>
             <wp:wrapNone/>
-            <wp:docPr descr="A blue and white logo&#10;&#10;Description automatically generated" id="13" name="image1.jpg"/>
+            <wp:docPr descr="A blue and white logo&#10;&#10;Description automatically generated" id="15" name="image13.jpg"/>
             <a:graphic>
               <a:graphicData uri="http://schemas.openxmlformats.org/drawingml/2006/picture">
                 <pic:pic>
                   <pic:nvPicPr>
-                    <pic:cNvPr descr="A blue and white logo&#10;&#10;Description automatically generated" id="0" name="image1.jpg"/>
+                    <pic:cNvPr descr="A blue and white logo&#10;&#10;Description automatically generated" id="0" name="image13.jpg"/>
                     <pic:cNvPicPr preferRelativeResize="0"/>
                   </pic:nvPicPr>
                   <pic:blipFill>
@@ -3826,91 +3826,18 @@
         </w:rPr>
         <w:drawing>
           <wp:inline distB="114300" distT="114300" distL="114300" distR="114300">
-            <wp:extent cx="5731200" cy="4953000"/>
+            <wp:extent cx="5731200" cy="4635500"/>
             <wp:effectExtent b="0" l="0" r="0" t="0"/>
-            <wp:docPr id="16" name="image12.png"/>
+            <wp:docPr id="6" name="image6.png"/>
             <a:graphic>
               <a:graphicData uri="http://schemas.openxmlformats.org/drawingml/2006/picture">
                 <pic:pic>
                   <pic:nvPicPr>
-                    <pic:cNvPr id="0" name="image12.png"/>
+                    <pic:cNvPr id="0" name="image6.png"/>
                     <pic:cNvPicPr preferRelativeResize="0"/>
                   </pic:nvPicPr>
                   <pic:blipFill>
                     <a:blip r:embed="rId11"/>
-                    <a:srcRect b="0" l="0" r="0" t="0"/>
-                    <a:stretch>
-                      <a:fillRect/>
-                    </a:stretch>
-                  </pic:blipFill>
-                  <pic:spPr>
-                    <a:xfrm>
-                      <a:off x="0" y="0"/>
-                      <a:ext cx="5731200" cy="4953000"/>
-                    </a:xfrm>
-                    <a:prstGeom prst="rect"/>
-                    <a:ln/>
-                  </pic:spPr>
-                </pic:pic>
-              </a:graphicData>
-            </a:graphic>
-          </wp:inline>
-        </w:drawing>
-      </w:r>
-      <w:r>
-        <w:rPr>
-          <w:rtl w:val="0"/>
-        </w:rPr>
-      </w:r>
-    </w:p>
-    <w:p>
-      <w:pPr>
-        <w:spacing w:line="240" w:lineRule="auto"/>
-        <w:rPr>
-          <w:rFonts w:ascii="Times New Roman" w:cs="Times New Roman" w:eastAsia="Times New Roman" w:hAnsi="Times New Roman"/>
-          <w:sz w:val="24"/>
-          <w:szCs w:val="24"/>
-        </w:rPr>
-      </w:pPr>
-      <w:r>
-        <w:rPr>
-          <w:rFonts w:ascii="Times New Roman" w:cs="Times New Roman" w:eastAsia="Times New Roman" w:hAnsi="Times New Roman"/>
-          <w:sz w:val="24"/>
-          <w:szCs w:val="24"/>
-          <w:rtl w:val="0"/>
-        </w:rPr>
-        <w:t xml:space="preserve">Рис 1 #practise_work</w:t>
-      </w:r>
-    </w:p>
-    <w:p>
-      <w:pPr>
-        <w:spacing w:line="240" w:lineRule="auto"/>
-        <w:rPr>
-          <w:rFonts w:ascii="Times New Roman" w:cs="Times New Roman" w:eastAsia="Times New Roman" w:hAnsi="Times New Roman"/>
-          <w:sz w:val="24"/>
-          <w:szCs w:val="24"/>
-        </w:rPr>
-      </w:pPr>
-      <w:r>
-        <w:rPr>
-          <w:rFonts w:ascii="Times New Roman" w:cs="Times New Roman" w:eastAsia="Times New Roman" w:hAnsi="Times New Roman"/>
-          <w:sz w:val="24"/>
-          <w:szCs w:val="24"/>
-        </w:rPr>
-        <w:drawing>
-          <wp:inline distB="114300" distT="114300" distL="114300" distR="114300">
-            <wp:extent cx="5731200" cy="4635500"/>
-            <wp:effectExtent b="0" l="0" r="0" t="0"/>
-            <wp:docPr id="9" name="image5.png"/>
-            <a:graphic>
-              <a:graphicData uri="http://schemas.openxmlformats.org/drawingml/2006/picture">
-                <pic:pic>
-                  <pic:nvPicPr>
-                    <pic:cNvPr id="0" name="image5.png"/>
-                    <pic:cNvPicPr preferRelativeResize="0"/>
-                  </pic:nvPicPr>
-                  <pic:blipFill>
-                    <a:blip r:embed="rId12"/>
                     <a:srcRect b="0" l="0" r="0" t="0"/>
                     <a:stretch>
                       <a:fillRect/>
@@ -3947,8 +3874,12 @@
       </w:pPr>
       <w:r>
         <w:rPr>
-          <w:rtl w:val="0"/>
-        </w:rPr>
+          <w:rFonts w:ascii="Times New Roman" w:cs="Times New Roman" w:eastAsia="Times New Roman" w:hAnsi="Times New Roman"/>
+          <w:sz w:val="24"/>
+          <w:szCs w:val="24"/>
+          <w:rtl w:val="0"/>
+        </w:rPr>
+        <w:t xml:space="preserve">Рис 1 #practise_work</w:t>
       </w:r>
     </w:p>
     <w:p>
@@ -3962,12 +3893,8 @@
       </w:pPr>
       <w:r>
         <w:rPr>
-          <w:rFonts w:ascii="Times New Roman" w:cs="Times New Roman" w:eastAsia="Times New Roman" w:hAnsi="Times New Roman"/>
-          <w:sz w:val="24"/>
-          <w:szCs w:val="24"/>
-          <w:rtl w:val="0"/>
-        </w:rPr>
-        <w:t xml:space="preserve">Рис 2 #practise_work</w:t>
+          <w:rtl w:val="0"/>
+        </w:rPr>
       </w:r>
     </w:p>
     <w:p>
@@ -3987,14 +3914,87 @@
         </w:rPr>
         <w:drawing>
           <wp:inline distB="114300" distT="114300" distL="114300" distR="114300">
-            <wp:extent cx="5731200" cy="4686300"/>
+            <wp:extent cx="5731200" cy="4660900"/>
             <wp:effectExtent b="0" l="0" r="0" t="0"/>
-            <wp:docPr id="19" name="image6.png"/>
+            <wp:docPr id="14" name="image12.png"/>
             <a:graphic>
               <a:graphicData uri="http://schemas.openxmlformats.org/drawingml/2006/picture">
                 <pic:pic>
                   <pic:nvPicPr>
-                    <pic:cNvPr id="0" name="image6.png"/>
+                    <pic:cNvPr id="0" name="image12.png"/>
+                    <pic:cNvPicPr preferRelativeResize="0"/>
+                  </pic:nvPicPr>
+                  <pic:blipFill>
+                    <a:blip r:embed="rId12"/>
+                    <a:srcRect b="0" l="0" r="0" t="0"/>
+                    <a:stretch>
+                      <a:fillRect/>
+                    </a:stretch>
+                  </pic:blipFill>
+                  <pic:spPr>
+                    <a:xfrm>
+                      <a:off x="0" y="0"/>
+                      <a:ext cx="5731200" cy="4660900"/>
+                    </a:xfrm>
+                    <a:prstGeom prst="rect"/>
+                    <a:ln/>
+                  </pic:spPr>
+                </pic:pic>
+              </a:graphicData>
+            </a:graphic>
+          </wp:inline>
+        </w:drawing>
+      </w:r>
+      <w:r>
+        <w:rPr>
+          <w:rtl w:val="0"/>
+        </w:rPr>
+      </w:r>
+    </w:p>
+    <w:p>
+      <w:pPr>
+        <w:spacing w:line="240" w:lineRule="auto"/>
+        <w:rPr>
+          <w:rFonts w:ascii="Times New Roman" w:cs="Times New Roman" w:eastAsia="Times New Roman" w:hAnsi="Times New Roman"/>
+          <w:sz w:val="24"/>
+          <w:szCs w:val="24"/>
+        </w:rPr>
+      </w:pPr>
+      <w:r>
+        <w:rPr>
+          <w:rFonts w:ascii="Times New Roman" w:cs="Times New Roman" w:eastAsia="Times New Roman" w:hAnsi="Times New Roman"/>
+          <w:sz w:val="24"/>
+          <w:szCs w:val="24"/>
+          <w:rtl w:val="0"/>
+        </w:rPr>
+        <w:t xml:space="preserve">Рис 2 #practise_work</w:t>
+      </w:r>
+    </w:p>
+    <w:p>
+      <w:pPr>
+        <w:spacing w:line="240" w:lineRule="auto"/>
+        <w:rPr>
+          <w:rFonts w:ascii="Times New Roman" w:cs="Times New Roman" w:eastAsia="Times New Roman" w:hAnsi="Times New Roman"/>
+          <w:sz w:val="24"/>
+          <w:szCs w:val="24"/>
+        </w:rPr>
+      </w:pPr>
+      <w:r>
+        <w:rPr>
+          <w:rFonts w:ascii="Times New Roman" w:cs="Times New Roman" w:eastAsia="Times New Roman" w:hAnsi="Times New Roman"/>
+          <w:sz w:val="24"/>
+          <w:szCs w:val="24"/>
+        </w:rPr>
+        <w:drawing>
+          <wp:inline distB="114300" distT="114300" distL="114300" distR="114300">
+            <wp:extent cx="5731200" cy="4737100"/>
+            <wp:effectExtent b="0" l="0" r="0" t="0"/>
+            <wp:docPr id="1" name="image1.png"/>
+            <a:graphic>
+              <a:graphicData uri="http://schemas.openxmlformats.org/drawingml/2006/picture">
+                <pic:pic>
+                  <pic:nvPicPr>
+                    <pic:cNvPr id="0" name="image1.png"/>
                     <pic:cNvPicPr preferRelativeResize="0"/>
                   </pic:nvPicPr>
                   <pic:blipFill>
@@ -4007,7 +4007,7 @@
                   <pic:spPr>
                     <a:xfrm>
                       <a:off x="0" y="0"/>
-                      <a:ext cx="5731200" cy="4686300"/>
+                      <a:ext cx="5731200" cy="4737100"/>
                     </a:xfrm>
                     <a:prstGeom prst="rect"/>
                     <a:ln/>
@@ -4060,14 +4060,14 @@
         </w:rPr>
         <w:drawing>
           <wp:inline distB="114300" distT="114300" distL="114300" distR="114300">
-            <wp:extent cx="5731200" cy="4533900"/>
+            <wp:extent cx="5731200" cy="4559300"/>
             <wp:effectExtent b="0" l="0" r="0" t="0"/>
-            <wp:docPr id="12" name="image2.png"/>
+            <wp:docPr id="8" name="image8.png"/>
             <a:graphic>
               <a:graphicData uri="http://schemas.openxmlformats.org/drawingml/2006/picture">
                 <pic:pic>
                   <pic:nvPicPr>
-                    <pic:cNvPr id="0" name="image2.png"/>
+                    <pic:cNvPr id="0" name="image8.png"/>
                     <pic:cNvPicPr preferRelativeResize="0"/>
                   </pic:nvPicPr>
                   <pic:blipFill>
@@ -4080,7 +4080,7 @@
                   <pic:spPr>
                     <a:xfrm>
                       <a:off x="0" y="0"/>
-                      <a:ext cx="5731200" cy="4533900"/>
+                      <a:ext cx="5731200" cy="4559300"/>
                     </a:xfrm>
                     <a:prstGeom prst="rect"/>
                     <a:ln/>
@@ -4133,14 +4133,14 @@
         </w:rPr>
         <w:drawing>
           <wp:inline distB="114300" distT="114300" distL="114300" distR="114300">
-            <wp:extent cx="5731200" cy="4953000"/>
+            <wp:extent cx="5731200" cy="5105400"/>
             <wp:effectExtent b="0" l="0" r="0" t="0"/>
-            <wp:docPr id="5" name="image8.png"/>
+            <wp:docPr id="9" name="image9.png"/>
             <a:graphic>
               <a:graphicData uri="http://schemas.openxmlformats.org/drawingml/2006/picture">
                 <pic:pic>
                   <pic:nvPicPr>
-                    <pic:cNvPr id="0" name="image8.png"/>
+                    <pic:cNvPr id="0" name="image9.png"/>
                     <pic:cNvPicPr preferRelativeResize="0"/>
                   </pic:nvPicPr>
                   <pic:blipFill>
@@ -4153,7 +4153,7 @@
                   <pic:spPr>
                     <a:xfrm>
                       <a:off x="0" y="0"/>
-                      <a:ext cx="5731200" cy="4953000"/>
+                      <a:ext cx="5731200" cy="5105400"/>
                     </a:xfrm>
                     <a:prstGeom prst="rect"/>
                     <a:ln/>
@@ -4400,12 +4400,12 @@
           <wp:inline distB="114300" distT="114300" distL="114300" distR="114300">
             <wp:extent cx="5731200" cy="3098800"/>
             <wp:effectExtent b="0" l="0" r="0" t="0"/>
-            <wp:docPr id="3" name="image16.png"/>
+            <wp:docPr id="4" name="image4.png"/>
             <a:graphic>
               <a:graphicData uri="http://schemas.openxmlformats.org/drawingml/2006/picture">
                 <pic:pic>
                   <pic:nvPicPr>
-                    <pic:cNvPr id="0" name="image16.png"/>
+                    <pic:cNvPr id="0" name="image4.png"/>
                     <pic:cNvPicPr preferRelativeResize="0"/>
                   </pic:nvPicPr>
                   <pic:blipFill>
@@ -4544,12 +4544,12 @@
           <wp:inline distB="114300" distT="114300" distL="114300" distR="114300">
             <wp:extent cx="5731200" cy="3098800"/>
             <wp:effectExtent b="0" l="0" r="0" t="0"/>
-            <wp:docPr id="2" name="image18.png"/>
+            <wp:docPr id="3" name="image3.png"/>
             <a:graphic>
               <a:graphicData uri="http://schemas.openxmlformats.org/drawingml/2006/picture">
                 <pic:pic>
                   <pic:nvPicPr>
-                    <pic:cNvPr id="0" name="image18.png"/>
+                    <pic:cNvPr id="0" name="image3.png"/>
                     <pic:cNvPicPr preferRelativeResize="0"/>
                   </pic:nvPicPr>
                   <pic:blipFill>
@@ -4632,7 +4632,7 @@
           <wp:inline distB="114300" distT="114300" distL="114300" distR="114300">
             <wp:extent cx="5731200" cy="3403600"/>
             <wp:effectExtent b="0" l="0" r="0" t="0"/>
-            <wp:docPr id="17" name="image21.png"/>
+            <wp:docPr id="18" name="image21.png"/>
             <a:graphic>
               <a:graphicData uri="http://schemas.openxmlformats.org/drawingml/2006/picture">
                 <pic:pic>
@@ -4756,12 +4756,12 @@
           <wp:inline distB="114300" distT="114300" distL="114300" distR="114300">
             <wp:extent cx="5731200" cy="5715000"/>
             <wp:effectExtent b="0" l="0" r="0" t="0"/>
-            <wp:docPr id="20" name="image11.png"/>
+            <wp:docPr id="20" name="image18.png"/>
             <a:graphic>
               <a:graphicData uri="http://schemas.openxmlformats.org/drawingml/2006/picture">
                 <pic:pic>
                   <pic:nvPicPr>
-                    <pic:cNvPr id="0" name="image11.png"/>
+                    <pic:cNvPr id="0" name="image18.png"/>
                     <pic:cNvPicPr preferRelativeResize="0"/>
                   </pic:nvPicPr>
                   <pic:blipFill>
@@ -4899,12 +4899,12 @@
           <wp:inline distB="114300" distT="114300" distL="114300" distR="114300">
             <wp:extent cx="5731200" cy="3822700"/>
             <wp:effectExtent b="0" l="0" r="0" t="0"/>
-            <wp:docPr id="6" name="image20.png"/>
+            <wp:docPr id="7" name="image7.png"/>
             <a:graphic>
               <a:graphicData uri="http://schemas.openxmlformats.org/drawingml/2006/picture">
                 <pic:pic>
                   <pic:nvPicPr>
-                    <pic:cNvPr id="0" name="image20.png"/>
+                    <pic:cNvPr id="0" name="image7.png"/>
                     <pic:cNvPicPr preferRelativeResize="0"/>
                   </pic:nvPicPr>
                   <pic:blipFill>
@@ -5026,12 +5026,12 @@
           <wp:inline distB="114300" distT="114300" distL="114300" distR="114300">
             <wp:extent cx="5731200" cy="2908300"/>
             <wp:effectExtent b="0" l="0" r="0" t="0"/>
-            <wp:docPr id="10" name="image4.png"/>
+            <wp:docPr id="12" name="image11.png"/>
             <a:graphic>
               <a:graphicData uri="http://schemas.openxmlformats.org/drawingml/2006/picture">
                 <pic:pic>
                   <pic:nvPicPr>
-                    <pic:cNvPr id="0" name="image4.png"/>
+                    <pic:cNvPr id="0" name="image11.png"/>
                     <pic:cNvPicPr preferRelativeResize="0"/>
                   </pic:nvPicPr>
                   <pic:blipFill>
@@ -5146,12 +5146,12 @@
           <wp:inline distB="114300" distT="114300" distL="114300" distR="114300">
             <wp:extent cx="5731200" cy="2730500"/>
             <wp:effectExtent b="0" l="0" r="0" t="0"/>
-            <wp:docPr id="4" name="image7.png"/>
+            <wp:docPr id="5" name="image5.png"/>
             <a:graphic>
               <a:graphicData uri="http://schemas.openxmlformats.org/drawingml/2006/picture">
                 <pic:pic>
                   <pic:nvPicPr>
-                    <pic:cNvPr id="0" name="image7.png"/>
+                    <pic:cNvPr id="0" name="image5.png"/>
                     <pic:cNvPicPr preferRelativeResize="0"/>
                   </pic:nvPicPr>
                   <pic:blipFill>
@@ -5273,12 +5273,12 @@
           <wp:inline distB="114300" distT="114300" distL="114300" distR="114300">
             <wp:extent cx="5731200" cy="3886200"/>
             <wp:effectExtent b="0" l="0" r="0" t="0"/>
-            <wp:docPr id="15" name="image3.png"/>
+            <wp:docPr id="17" name="image17.png"/>
             <a:graphic>
               <a:graphicData uri="http://schemas.openxmlformats.org/drawingml/2006/picture">
                 <pic:pic>
                   <pic:nvPicPr>
-                    <pic:cNvPr id="0" name="image3.png"/>
+                    <pic:cNvPr id="0" name="image17.png"/>
                     <pic:cNvPicPr preferRelativeResize="0"/>
                   </pic:nvPicPr>
                   <pic:blipFill>
@@ -5440,7 +5440,7 @@
           <wp:inline distB="114300" distT="114300" distL="114300" distR="114300">
             <wp:extent cx="5731200" cy="2959100"/>
             <wp:effectExtent b="0" l="0" r="0" t="0"/>
-            <wp:docPr id="11" name="image15.png"/>
+            <wp:docPr id="13" name="image15.png"/>
             <a:graphic>
               <a:graphicData uri="http://schemas.openxmlformats.org/drawingml/2006/picture">
                 <pic:pic>
@@ -5638,7 +5638,7 @@
           <wp:inline distB="114300" distT="114300" distL="114300" distR="114300">
             <wp:extent cx="5731200" cy="3416300"/>
             <wp:effectExtent b="0" l="0" r="0" t="0"/>
-            <wp:docPr id="8" name="image10.png"/>
+            <wp:docPr id="11" name="image10.png"/>
             <a:graphic>
               <a:graphicData uri="http://schemas.openxmlformats.org/drawingml/2006/picture">
                 <pic:pic>
@@ -5759,12 +5759,12 @@
           <wp:inline distB="114300" distT="114300" distL="114300" distR="114300">
             <wp:extent cx="5731200" cy="3073400"/>
             <wp:effectExtent b="0" l="0" r="0" t="0"/>
-            <wp:docPr id="21" name="image13.png"/>
+            <wp:docPr id="21" name="image19.png"/>
             <a:graphic>
               <a:graphicData uri="http://schemas.openxmlformats.org/drawingml/2006/picture">
                 <pic:pic>
                   <pic:nvPicPr>
-                    <pic:cNvPr id="0" name="image13.png"/>
+                    <pic:cNvPr id="0" name="image19.png"/>
                     <pic:cNvPicPr preferRelativeResize="0"/>
                   </pic:nvPicPr>
                   <pic:blipFill>
@@ -22024,12 +22024,12 @@
           <wp:inline distB="114300" distT="114300" distL="114300" distR="114300">
             <wp:extent cx="5731200" cy="3416300"/>
             <wp:effectExtent b="0" l="0" r="0" t="0"/>
-            <wp:docPr id="18" name="image9.png"/>
+            <wp:docPr id="19" name="image20.png"/>
             <a:graphic>
               <a:graphicData uri="http://schemas.openxmlformats.org/drawingml/2006/picture">
                 <pic:pic>
                   <pic:nvPicPr>
-                    <pic:cNvPr id="0" name="image9.png"/>
+                    <pic:cNvPr id="0" name="image20.png"/>
                     <pic:cNvPicPr preferRelativeResize="0"/>
                   </pic:nvPicPr>
                   <pic:blipFill>
@@ -22140,12 +22140,12 @@
           <wp:inline distB="114300" distT="114300" distL="114300" distR="114300">
             <wp:extent cx="5731200" cy="3429000"/>
             <wp:effectExtent b="0" l="0" r="0" t="0"/>
-            <wp:docPr id="14" name="image14.png"/>
+            <wp:docPr id="16" name="image16.png"/>
             <a:graphic>
               <a:graphicData uri="http://schemas.openxmlformats.org/drawingml/2006/picture">
                 <pic:pic>
                   <pic:nvPicPr>
-                    <pic:cNvPr id="0" name="image14.png"/>
+                    <pic:cNvPr id="0" name="image16.png"/>
                     <pic:cNvPicPr preferRelativeResize="0"/>
                   </pic:nvPicPr>
                   <pic:blipFill>
@@ -22266,12 +22266,12 @@
           <wp:inline distB="114300" distT="114300" distL="114300" distR="114300">
             <wp:extent cx="4790086" cy="8224838"/>
             <wp:effectExtent b="0" l="0" r="0" t="0"/>
-            <wp:docPr id="7" name="image17.png"/>
+            <wp:docPr id="10" name="image14.png"/>
             <a:graphic>
               <a:graphicData uri="http://schemas.openxmlformats.org/drawingml/2006/picture">
                 <pic:pic>
                   <pic:nvPicPr>
-                    <pic:cNvPr id="0" name="image17.png"/>
+                    <pic:cNvPr id="0" name="image14.png"/>
                     <pic:cNvPicPr preferRelativeResize="0"/>
                   </pic:nvPicPr>
                   <pic:blipFill>
@@ -22336,12 +22336,12 @@
           <wp:inline distB="114300" distT="114300" distL="114300" distR="114300">
             <wp:extent cx="5731200" cy="1104900"/>
             <wp:effectExtent b="0" l="0" r="0" t="0"/>
-            <wp:docPr id="1" name="image19.png"/>
+            <wp:docPr id="2" name="image2.png"/>
             <a:graphic>
               <a:graphicData uri="http://schemas.openxmlformats.org/drawingml/2006/picture">
                 <pic:pic>
                   <pic:nvPicPr>
-                    <pic:cNvPr id="0" name="image19.png"/>
+                    <pic:cNvPr id="0" name="image2.png"/>
                     <pic:cNvPicPr preferRelativeResize="0"/>
                   </pic:nvPicPr>
                   <pic:blipFill>

</xml_diff>